<commit_message>
07/29 lang & data tools start course.
</commit_message>
<xml_diff>
--- a/Cours/Présentation des outils et des langages de données.docx
+++ b/Cours/Présentation des outils et des langages de données.docx
@@ -3103,13 +3103,13 @@
         <w:pStyle w:val="Titre1"/>
       </w:pPr>
       <w:bookmarkStart w:id="0" w:name="_Toc236172762"/>
-      <w:bookmarkStart w:id="1" w:name="_Toc230383571"/>
-      <w:bookmarkStart w:id="2" w:name="_Toc236249017"/>
+      <w:bookmarkStart w:id="1" w:name="_Toc236249017"/>
+      <w:bookmarkStart w:id="2" w:name="_Toc230383571"/>
       <w:r>
         <w:t>Aperçu</w:t>
       </w:r>
       <w:bookmarkEnd w:id="0"/>
-      <w:bookmarkEnd w:id="2"/>
+      <w:bookmarkEnd w:id="1"/>
     </w:p>
     <w:p>
       <w:r>
@@ -3227,20 +3227,42 @@
         </w:drawing>
       </w:r>
       <w:r>
+        <w:rPr>
+          <w:b/>
+          <w:bCs/>
+        </w:rPr>
         <w:t>Concepts clés</w:t>
       </w:r>
-      <w:bookmarkEnd w:id="1"/>
-    </w:p>
-    <w:p>
-      <w:r>
+      <w:bookmarkEnd w:id="2"/>
+    </w:p>
+    <w:p>
+      <w:pPr>
+        <w:rPr>
+          <w:b/>
+          <w:bCs/>
+        </w:rPr>
+      </w:pPr>
+      <w:r>
+        <w:rPr>
+          <w:b/>
+          <w:bCs/>
+        </w:rPr>
         <w:t xml:space="preserve">(Key </w:t>
       </w:r>
       <w:proofErr w:type="spellStart"/>
       <w:r>
+        <w:rPr>
+          <w:b/>
+          <w:bCs/>
+        </w:rPr>
         <w:t>takeaways</w:t>
       </w:r>
       <w:proofErr w:type="spellEnd"/>
       <w:r>
+        <w:rPr>
+          <w:b/>
+          <w:bCs/>
+        </w:rPr>
         <w:t>)</w:t>
       </w:r>
     </w:p>
@@ -6225,6 +6247,9 @@
         <w:spacing w:after="0"/>
       </w:pPr>
       <w:r>
+        <w:rPr>
+          <w:noProof/>
+        </w:rPr>
         <w:drawing>
           <wp:inline distT="0" distB="0" distL="0" distR="0" wp14:anchorId="2470FF2F" wp14:editId="0B42AD50">
             <wp:extent cx="5760720" cy="3290570"/>
@@ -6353,6 +6378,9 @@
     </w:p>
     <w:p>
       <w:r>
+        <w:rPr>
+          <w:noProof/>
+        </w:rPr>
         <w:lastRenderedPageBreak/>
         <w:drawing>
           <wp:inline distT="0" distB="0" distL="0" distR="0" wp14:anchorId="0370D8FB" wp14:editId="17FF9BD3">
@@ -6429,19 +6457,7 @@
           <w:rPr>
             <w:rStyle w:val="Lienhypertexte"/>
           </w:rPr>
-          <w:t>GitHub Docs(s'ouvre dans un nouv</w:t>
-        </w:r>
-        <w:r>
-          <w:rPr>
-            <w:rStyle w:val="Lienhypertexte"/>
-          </w:rPr>
-          <w:t>e</w:t>
-        </w:r>
-        <w:r>
-          <w:rPr>
-            <w:rStyle w:val="Lienhypertexte"/>
-          </w:rPr>
-          <w:t>l onglet)</w:t>
+          <w:t>GitHub Docs(s'ouvre dans un nouvel onglet)</w:t>
         </w:r>
       </w:hyperlink>
       <w:r>
@@ -6475,19 +6491,7 @@
           <w:rPr>
             <w:rStyle w:val="Lienhypertexte"/>
           </w:rPr>
-          <w:t xml:space="preserve">(s'ouvre </w:t>
-        </w:r>
-        <w:r>
-          <w:rPr>
-            <w:rStyle w:val="Lienhypertexte"/>
-          </w:rPr>
-          <w:t>d</w:t>
-        </w:r>
-        <w:r>
-          <w:rPr>
-            <w:rStyle w:val="Lienhypertexte"/>
-          </w:rPr>
-          <w:t>ans un nouvel onglet)</w:t>
+          <w:t>(s'ouvre dans un nouvel onglet)</w:t>
         </w:r>
       </w:hyperlink>
       <w:r>
@@ -6514,6 +6518,9 @@
     </w:p>
     <w:p>
       <w:r>
+        <w:rPr>
+          <w:noProof/>
+        </w:rPr>
         <w:drawing>
           <wp:inline distT="0" distB="0" distL="0" distR="0" wp14:anchorId="6429A0CB" wp14:editId="44E27156">
             <wp:extent cx="3600000" cy="2794909"/>
@@ -7104,7 +7111,7 @@
       <w:rPr>
         <w:noProof/>
       </w:rPr>
-      <w:t>29/07/2026 19:20</w:t>
+      <w:t>29/07/2026 20:23</w:t>
     </w:r>
     <w:r>
       <w:fldChar w:fldCharType="end"/>
@@ -7217,13 +7224,8 @@
       <w:r>
         <w:t xml:space="preserve"> </w:t>
       </w:r>
-      <w:proofErr w:type="gramStart"/>
-      <w:r>
-        <w:t>Et</w:t>
-      </w:r>
-      <w:proofErr w:type="gramEnd"/>
-      <w:r>
-        <w:t xml:space="preserve"> bien réelle !</w:t>
+      <w:r>
+        <w:t>Et bien réelle !</w:t>
       </w:r>
     </w:p>
   </w:footnote>
@@ -7241,29 +7243,8 @@
       <w:r>
         <w:t xml:space="preserve"> Comme les Python </w:t>
       </w:r>
-      <w:proofErr w:type="spellStart"/>
-      <w:r>
-        <w:t>Enhancement</w:t>
-      </w:r>
-      <w:proofErr w:type="spellEnd"/>
-      <w:r>
-        <w:t xml:space="preserve"> </w:t>
-      </w:r>
-      <w:proofErr w:type="spellStart"/>
-      <w:r>
-        <w:t>Proposals</w:t>
-      </w:r>
-      <w:proofErr w:type="spellEnd"/>
-      <w:r>
-        <w:t xml:space="preserve"> (</w:t>
-      </w:r>
-      <w:proofErr w:type="spellStart"/>
-      <w:r>
-        <w:t>PEPs</w:t>
-      </w:r>
-      <w:proofErr w:type="spellEnd"/>
-      <w:r>
-        <w:t>)</w:t>
+      <w:r>
+        <w:t>Enhancement Proposals (PEPs)</w:t>
       </w:r>
     </w:p>
   </w:footnote>
@@ -7284,21 +7265,8 @@
       <w:r>
         <w:t xml:space="preserve">JEP (Java </w:t>
       </w:r>
-      <w:proofErr w:type="spellStart"/>
-      <w:r>
-        <w:t>Enhancement</w:t>
-      </w:r>
-      <w:proofErr w:type="spellEnd"/>
-      <w:r>
-        <w:t xml:space="preserve"> </w:t>
-      </w:r>
-      <w:proofErr w:type="spellStart"/>
-      <w:r>
-        <w:t>Proposal</w:t>
-      </w:r>
-      <w:proofErr w:type="spellEnd"/>
-      <w:r>
-        <w:t>)</w:t>
+      <w:r>
+        <w:t>Enhancement Proposal)</w:t>
       </w:r>
     </w:p>
   </w:footnote>
@@ -7555,7 +7523,7 @@
             <w:rPr>
               <w:noProof/>
             </w:rPr>
-            <w:t>29/07/2026 19:22</w:t>
+            <w:t>29/07/2026 20:38</w:t>
           </w:r>
           <w:r>
             <w:fldChar w:fldCharType="end"/>
@@ -9867,6 +9835,7 @@
   <w:style w:type="character" w:default="1" w:styleId="Policepardfaut">
     <w:name w:val="Default Paragraph Font"/>
     <w:uiPriority w:val="1"/>
+    <w:semiHidden/>
     <w:unhideWhenUsed/>
   </w:style>
   <w:style w:type="table" w:default="1" w:styleId="TableauNormal">

</xml_diff>